<commit_message>
feat(invoice): support cancellation invoices in the Word template
Provide isStorno, Originalrechnungsnummer and Originalrechnungsdatum to the
invoice template, so a cancellation invoice shares the template of the
invoice. The packaged template states the cancelled invoice instead of the
type and drops the payment sentence for a cancellation.
</commit_message>
<xml_diff>
--- a/projectforge-business/src/main/resources/officeTemplates/InvoiceTemplate.docx
+++ b/projectforge-business/src/main/resources/officeTemplates/InvoiceTemplate.docx
@@ -780,10 +780,30 @@
       <w:r>
         <w:rPr>
           <w:rFonts w:ascii="Arial" w:hAnsi="Arial"/>
+          <w:color w:val="000000" w:themeColor="text1"/>
+          <w:sz w:val="16"/>
+          <w:szCs w:val="16"/>
+          <w:highlight w:val="yellow"/>
+        </w:rPr>
+        <w:t xml:space="preserve">{if isStorno=false}</w:t>
+      </w:r>
+      <w:r>
+        <w:rPr>
+          <w:rFonts w:ascii="Arial" w:hAnsi="Arial"/>
           <w:b/>
           <w:bCs/>
         </w:rPr>
-        <w:t>$</w:t>
+        <w:t xml:space="preserve">${Typ}</w:t>
+      </w:r>
+      <w:r>
+        <w:rPr>
+          <w:rFonts w:ascii="Arial" w:hAnsi="Arial"/>
+          <w:color w:val="000000" w:themeColor="text1"/>
+          <w:sz w:val="16"/>
+          <w:szCs w:val="16"/>
+          <w:highlight w:val="yellow"/>
+        </w:rPr>
+        <w:t xml:space="preserve">{endif}{if isStorno=true}</w:t>
       </w:r>
       <w:r>
         <w:rPr>
@@ -791,7 +811,17 @@
           <w:b/>
           <w:bCs/>
         </w:rPr>
-        <w:t>{Typ}</w:t>
+        <w:t xml:space="preserve">Stornorechnung zur Rechnung ${Originalrechnungsnummer} vom ${Originalrechnungsdatum}</w:t>
+      </w:r>
+      <w:r>
+        <w:rPr>
+          <w:rFonts w:ascii="Arial" w:hAnsi="Arial"/>
+          <w:color w:val="000000" w:themeColor="text1"/>
+          <w:sz w:val="16"/>
+          <w:szCs w:val="16"/>
+          <w:highlight w:val="yellow"/>
+        </w:rPr>
+        <w:t xml:space="preserve">{endif}</w:t>
       </w:r>
       <w:r>
         <w:rPr>
@@ -1706,7 +1736,7 @@
           <w:szCs w:val="16"/>
           <w:highlight w:val="yellow"/>
         </w:rPr>
-        <w:t xml:space="preserve">{if </w:t>
+        <w:t xml:space="preserve">{if isStorno=false}</w:t>
       </w:r>
       <w:r>
         <w:rPr>
@@ -1716,7 +1746,7 @@
           <w:szCs w:val="16"/>
           <w:highlight w:val="yellow"/>
         </w:rPr>
-        <w:t>isS</w:t>
+        <w:t xml:space="preserve">{if </w:t>
       </w:r>
       <w:r>
         <w:rPr>
@@ -1726,7 +1756,7 @@
           <w:szCs w:val="16"/>
           <w:highlight w:val="yellow"/>
         </w:rPr>
-        <w:t>konto=</w:t>
+        <w:t>isS</w:t>
       </w:r>
       <w:r>
         <w:rPr>
@@ -1736,7 +1766,7 @@
           <w:szCs w:val="16"/>
           <w:highlight w:val="yellow"/>
         </w:rPr>
-        <w:t>false</w:t>
+        <w:t>konto=</w:t>
       </w:r>
       <w:r>
         <w:rPr>
@@ -1746,28 +1776,7 @@
           <w:szCs w:val="16"/>
           <w:highlight w:val="yellow"/>
         </w:rPr>
-        <w:t>}</w:t>
-      </w:r>
-      <w:r>
-        <w:rPr>
-          <w:rFonts w:ascii="Arial" w:hAnsi="Arial"/>
-          <w:color w:val="000000" w:themeColor="text1"/>
-        </w:rPr>
-        <w:t xml:space="preserve">Wir danken Ihnen für Ihre Beauftragung und bitten um Überweisung des Gesamtbetrages bis zum </w:t>
-      </w:r>
-      <w:r>
-        <w:rPr>
-          <w:rFonts w:ascii="Arial" w:hAnsi="Arial"/>
-          <w:color w:val="000000" w:themeColor="text1"/>
-        </w:rPr>
-        <w:t>$</w:t>
-      </w:r>
-      <w:r>
-        <w:rPr>
-          <w:rFonts w:ascii="Arial" w:hAnsi="Arial"/>
-          <w:color w:val="000000" w:themeColor="text1"/>
-        </w:rPr>
-        <w:t>{Faelligkeit} auf eines der unten genannten Konten.</w:t>
+        <w:t>false</w:t>
       </w:r>
       <w:r>
         <w:rPr>
@@ -1777,7 +1786,28 @@
           <w:szCs w:val="16"/>
           <w:highlight w:val="yellow"/>
         </w:rPr>
-        <w:t xml:space="preserve">{endif}{if </w:t>
+        <w:t>}</w:t>
+      </w:r>
+      <w:r>
+        <w:rPr>
+          <w:rFonts w:ascii="Arial" w:hAnsi="Arial"/>
+          <w:color w:val="000000" w:themeColor="text1"/>
+        </w:rPr>
+        <w:t xml:space="preserve">Wir danken Ihnen für Ihre Beauftragung und bitten um Überweisung des Gesamtbetrages bis zum </w:t>
+      </w:r>
+      <w:r>
+        <w:rPr>
+          <w:rFonts w:ascii="Arial" w:hAnsi="Arial"/>
+          <w:color w:val="000000" w:themeColor="text1"/>
+        </w:rPr>
+        <w:t>$</w:t>
+      </w:r>
+      <w:r>
+        <w:rPr>
+          <w:rFonts w:ascii="Arial" w:hAnsi="Arial"/>
+          <w:color w:val="000000" w:themeColor="text1"/>
+        </w:rPr>
+        <w:t>{Faelligkeit} auf eines der unten genannten Konten.</w:t>
       </w:r>
       <w:r>
         <w:rPr>
@@ -1787,7 +1817,7 @@
           <w:szCs w:val="16"/>
           <w:highlight w:val="yellow"/>
         </w:rPr>
-        <w:t>isS</w:t>
+        <w:t xml:space="preserve">{endif}{if </w:t>
       </w:r>
       <w:r>
         <w:rPr>
@@ -1797,7 +1827,7 @@
           <w:szCs w:val="16"/>
           <w:highlight w:val="yellow"/>
         </w:rPr>
-        <w:t>konto=</w:t>
+        <w:t>isS</w:t>
       </w:r>
       <w:r>
         <w:rPr>
@@ -1807,7 +1837,7 @@
           <w:szCs w:val="16"/>
           <w:highlight w:val="yellow"/>
         </w:rPr>
-        <w:t>true</w:t>
+        <w:t>konto=</w:t>
       </w:r>
       <w:r>
         <w:rPr>
@@ -1817,56 +1847,7 @@
           <w:szCs w:val="16"/>
           <w:highlight w:val="yellow"/>
         </w:rPr>
-        <w:t>}</w:t>
-      </w:r>
-      <w:r>
-        <w:rPr>
-          <w:rFonts w:ascii="Arial" w:hAnsi="Arial"/>
-          <w:color w:val="000000" w:themeColor="text1"/>
-        </w:rPr>
-        <w:t xml:space="preserve">Wir danken Ihnen für Ihre Beauftragung und bitten um Überweisung des Gesamtbetrages abzüglich </w:t>
-      </w:r>
-      <w:r>
-        <w:rPr>
-          <w:rFonts w:ascii="Arial" w:hAnsi="Arial"/>
-          <w:color w:val="000000" w:themeColor="text1"/>
-        </w:rPr>
-        <w:t>$</w:t>
-      </w:r>
-      <w:r>
-        <w:rPr>
-          <w:rFonts w:ascii="Arial" w:hAnsi="Arial"/>
-          <w:color w:val="000000" w:themeColor="text1"/>
-        </w:rPr>
-        <w:t xml:space="preserve">{Skonto} Skonto bis zum </w:t>
-      </w:r>
-      <w:r>
-        <w:rPr>
-          <w:rFonts w:ascii="Arial" w:hAnsi="Arial"/>
-          <w:color w:val="000000" w:themeColor="text1"/>
-        </w:rPr>
-        <w:t>$</w:t>
-      </w:r>
-      <w:r>
-        <w:rPr>
-          <w:rFonts w:ascii="Arial" w:hAnsi="Arial"/>
-          <w:color w:val="000000" w:themeColor="text1"/>
-        </w:rPr>
-        <w:t xml:space="preserve">{Faelligkeit_Skonto} danach bis zum </w:t>
-      </w:r>
-      <w:r>
-        <w:rPr>
-          <w:rFonts w:ascii="Arial" w:hAnsi="Arial"/>
-          <w:color w:val="000000" w:themeColor="text1"/>
-        </w:rPr>
-        <w:t>$</w:t>
-      </w:r>
-      <w:r>
-        <w:rPr>
-          <w:rFonts w:ascii="Arial" w:hAnsi="Arial"/>
-          <w:color w:val="000000" w:themeColor="text1"/>
-        </w:rPr>
-        <w:t>{Faelligkeit} ohne Abzüge auf eines der unten genannten Konten.</w:t>
+        <w:t>true</w:t>
       </w:r>
       <w:r>
         <w:rPr>
@@ -1876,7 +1857,76 @@
           <w:szCs w:val="16"/>
           <w:highlight w:val="yellow"/>
         </w:rPr>
+        <w:t>}</w:t>
+      </w:r>
+      <w:r>
+        <w:rPr>
+          <w:rFonts w:ascii="Arial" w:hAnsi="Arial"/>
+          <w:color w:val="000000" w:themeColor="text1"/>
+        </w:rPr>
+        <w:t xml:space="preserve">Wir danken Ihnen für Ihre Beauftragung und bitten um Überweisung des Gesamtbetrages abzüglich </w:t>
+      </w:r>
+      <w:r>
+        <w:rPr>
+          <w:rFonts w:ascii="Arial" w:hAnsi="Arial"/>
+          <w:color w:val="000000" w:themeColor="text1"/>
+        </w:rPr>
+        <w:t>$</w:t>
+      </w:r>
+      <w:r>
+        <w:rPr>
+          <w:rFonts w:ascii="Arial" w:hAnsi="Arial"/>
+          <w:color w:val="000000" w:themeColor="text1"/>
+        </w:rPr>
+        <w:t xml:space="preserve">{Skonto} Skonto bis zum </w:t>
+      </w:r>
+      <w:r>
+        <w:rPr>
+          <w:rFonts w:ascii="Arial" w:hAnsi="Arial"/>
+          <w:color w:val="000000" w:themeColor="text1"/>
+        </w:rPr>
+        <w:t>$</w:t>
+      </w:r>
+      <w:r>
+        <w:rPr>
+          <w:rFonts w:ascii="Arial" w:hAnsi="Arial"/>
+          <w:color w:val="000000" w:themeColor="text1"/>
+        </w:rPr>
+        <w:t xml:space="preserve">{Faelligkeit_Skonto} danach bis zum </w:t>
+      </w:r>
+      <w:r>
+        <w:rPr>
+          <w:rFonts w:ascii="Arial" w:hAnsi="Arial"/>
+          <w:color w:val="000000" w:themeColor="text1"/>
+        </w:rPr>
+        <w:t>$</w:t>
+      </w:r>
+      <w:r>
+        <w:rPr>
+          <w:rFonts w:ascii="Arial" w:hAnsi="Arial"/>
+          <w:color w:val="000000" w:themeColor="text1"/>
+        </w:rPr>
+        <w:t>{Faelligkeit} ohne Abzüge auf eines der unten genannten Konten.</w:t>
+      </w:r>
+      <w:r>
+        <w:rPr>
+          <w:rFonts w:ascii="Arial" w:hAnsi="Arial"/>
+          <w:color w:val="000000" w:themeColor="text1"/>
+          <w:sz w:val="16"/>
+          <w:szCs w:val="16"/>
+          <w:highlight w:val="yellow"/>
+        </w:rPr>
         <w:t>{endif}</w:t>
+      </w:r>
+      <w:r>
+        <w:rPr>
+          <w:rFonts w:ascii="Arial" w:hAnsi="Arial"/>
+          <w:color w:val="000000" w:themeColor="text1"/>
+          <w:sz w:val="16"/>
+          <w:szCs w:val="16"/>
+          <w:highlight w:val="yellow"/>
+        </w:rPr>
+        <w:t xml:space="preserve">{endif}</w:t>
       </w:r>
     </w:p>
     <w:p>

</xml_diff>